<commit_message>
when fire docs: the client's plus, paging and attachments; function versions
Co-Authored-By: Claude Fable 5.1 <noreply@anthropic.com>
Claude-Session: https://claude.ai/code/session_01HRrFhT5c8JgMmXsdHDFnND
</commit_message>
<xml_diff>
--- a/when_fire/docs/after_action_report_2026-10-25.docx
+++ b/when_fire/docs/after_action_report_2026-10-25.docx
@@ -86,12 +86,12 @@
     </w:p>
     <w:p>
       <w:r>
-        <w:t>The functions.  watch (version 2), reconciler (9), thinker (3), doer (1), librarian (6), when-fire-mcp (4), copy (4), next-when-fire-mcp (1); listener (10) and when-fire-web (2) are stubs.</w:t>
+        <w:t>The functions.  watch (version 2), reconciler (9), thinker (3), doer (1), librarian (7), when-fire-mcp (5), copy (5), next-when-fire-mcp (1); listener (10) and when-fire-web (2) are stubs.</w:t>
       </w:r>
     </w:p>
     <w:p>
       <w:r>
-        <w:t>The client.  https://stacydraper.github.io/SuperHuman/ with five pages: Record, Whens, Thoughts, Questions, Settings.  It carries your key once from the address and keeps it.  The first load after the push may need one refresh if the old page was cached.</w:t>
+        <w:t>The client.  https://stacydraper.github.io/SuperHuman/ with five pages on one bar along the bottom: Record, Whens, Thoughts, Questions, Settings.  It carries your key once from the address and keeps it.  After your first look at it (9:15 AM) the Record page lost its about box, gained a plus that opens Camera, Photos and Files (any file rides along as a source the fact cites), and both Recent and Thoughts page with an Earlier button; the connector and the Librarian learned to take any attachment, not only pictures.  The first load after a push may need one refresh if the old page was cached.</w:t>
       </w:r>
     </w:p>
     <w:p>
@@ -119,7 +119,7 @@
     </w:p>
     <w:p>
       <w:r>
-        <w:t>Decisions I made alone, all reversible.  The day's cap for every actor together is 5.00 for today because the replay spent two dollars; it goes back to 3.00 tomorrow unless you say otherwise (the caps table, one row).  Turbo was switched off by hand after the glance set it for a day over the rope and leg day question; the glance may now set at most six hours.  The settle runs after every episode close and costs about a third of a dollar (five model calls); the Thinker's own cap of 1.50 a day holds it to four or five settles, after which it writes an error note and rests until the next day.  If that is too few, the cap is one number; if the settle is too eager, the noticer can be told to say nothing more often.  The copy door's run verb, which executed statements during the build, is still deployed; I will remove it as the last act of the day, after this report, so the only ways in are the doors.</w:t>
+        <w:t>Decisions I made alone, all reversible.  The day's cap for every actor together is 5.00 for today because the replay spent two dollars; it goes back to 3.00 tomorrow unless you say otherwise (the caps table, one row).  Turbo was switched off by hand after the glance set it for a day over the rope and leg day question; the glance may now set at most six hours.  The settle runs after every episode close and costs about a third of a dollar (five model calls); the Thinker's own cap of 1.50 a day holds it to four or five settles, after which it writes an error note and rests until the next day.  If that is too few, the cap is one number; if the settle is too eager, the noticer can be told to say nothing more often.  The copy door's run verb, which executed statements during the build, was removed after this report was first written (copy version 5), so the only ways in are the doors.</w:t>
       </w:r>
     </w:p>
     <w:p>
@@ -188,7 +188,7 @@
         <w:color w:val="666666"/>
         <w:sz w:val="18"/>
       </w:rPr>
-      <w:t>when fire, October 25, 2026</w:t>
+      <w:t>when fire: after action report  ·  living document</w:t>
     </w:r>
   </w:p>
 </w:hdr>

</xml_diff>

<commit_message>
when fire: the navigator seat in the Thinker and the documents
Co-Authored-By: Claude Fable 5.1 <noreply@anthropic.com>
Claude-Session: https://claude.ai/code/session_01HRrFhT5c8JgMmXsdHDFnND
</commit_message>
<xml_diff>
--- a/when_fire/docs/after_action_report_2026-10-25.docx
+++ b/when_fire/docs/after_action_report_2026-10-25.docx
@@ -68,7 +68,7 @@
     </w:p>
     <w:p>
       <w:r>
-        <w:t>8:42 AM: the first live cycle, unprompted.  The Heartbeat raised quiet thirty minutes after the rope fact landed; the Reconciler closed the orphan episode of Saturday morning, the Watch read Saturday again (met for the rope when; silence for the calf raises after it), the day of October 24 was written again with the session in it, and the Thinker settled through the yes-and way (noticer, builder, gatherer, honesty, closer) and chose nothing, since the one question worth asking already stood.</w:t>
+        <w:t>8:42 AM: the first live cycle, unprompted.  The Heartbeat raised quiet thirty minutes after the rope fact landed; the Reconciler closed the orphan episode of Saturday morning, the Watch read Saturday again (met for the rope when; silence for the calf raises after it), the day of October 24 was written again with the session in it, and the Thinker settled through the yes-and way (noticer, builder, gatherer, honesty, navigator) and chose nothing, since the one question worth asking already stood.</w:t>
       </w:r>
     </w:p>
     <w:p>
@@ -86,7 +86,7 @@
     </w:p>
     <w:p>
       <w:r>
-        <w:t>The functions.  watch (version 2), reconciler (9), thinker (3), doer (1), librarian (7), when-fire-mcp (5), copy (5), next-when-fire-mcp (1); listener (10) and when-fire-web (2) are stubs.</w:t>
+        <w:t>The functions.  watch (version 2), reconciler (9), thinker (4), doer (1), librarian (7), when-fire-mcp (5), copy (5), next-when-fire-mcp (1); listener (10) and when-fire-web (2) are stubs.</w:t>
       </w:r>
     </w:p>
     <w:p>

</xml_diff>